<commit_message>
updated request body formatting in Doc
</commit_message>
<xml_diff>
--- a/XIQ-AD-PPSK-Sync-Guide.docx
+++ b/XIQ-AD-PPSK-Sync-Guide.docx
@@ -1,6 +1,6 @@
 
 <file path=word/document.xml><?xml version="1.0" encoding="utf-8"?>
-<w:document xmlns:wpc="http://schemas.microsoft.com/office/word/2010/wordprocessingCanvas" xmlns:cx="http://schemas.microsoft.com/office/drawing/2014/chartex" xmlns:cx1="http://schemas.microsoft.com/office/drawing/2015/9/8/chartex" xmlns:cx2="http://schemas.microsoft.com/office/drawing/2015/10/21/chartex" xmlns:cx3="http://schemas.microsoft.com/office/drawing/2016/5/9/chartex" xmlns:cx4="http://schemas.microsoft.com/office/drawing/2016/5/10/chartex" xmlns:cx5="http://schemas.microsoft.com/office/drawing/2016/5/11/chartex" xmlns:cx6="http://schemas.microsoft.com/office/drawing/2016/5/12/chartex" xmlns:cx7="http://schemas.microsoft.com/office/drawing/2016/5/13/chartex" xmlns:cx8="http://schemas.microsoft.com/office/drawing/2016/5/14/chartex" xmlns:mc="http://schemas.openxmlformats.org/markup-compatibility/2006" xmlns:aink="http://schemas.microsoft.com/office/drawing/2016/ink" xmlns:am3d="http://schemas.microsoft.com/office/drawing/2017/model3d" xmlns:o="urn:schemas-microsoft-com:office:office" xmlns:oel="http://schemas.microsoft.com/office/2019/extlst" xmlns:r="http://schemas.openxmlformats.org/officeDocument/2006/relationships" xmlns:m="http://schemas.openxmlformats.org/officeDocument/2006/math" xmlns:v="urn:schemas-microsoft-com:vml" xmlns:wp14="http://schemas.microsoft.com/office/word/2010/wordprocessingDrawing" xmlns:wp="http://schemas.openxmlformats.org/drawingml/2006/wordprocessingDrawing" xmlns:w10="urn:schemas-microsoft-com:office:word" xmlns:w="http://schemas.openxmlformats.org/wordprocessingml/2006/main" xmlns:w14="http://schemas.microsoft.com/office/word/2010/wordml" xmlns:w15="http://schemas.microsoft.com/office/word/2012/wordml" xmlns:w16cex="http://schemas.microsoft.com/office/word/2018/wordml/cex" xmlns:w16cid="http://schemas.microsoft.com/office/word/2016/wordml/cid" xmlns:w16="http://schemas.microsoft.com/office/word/2018/wordml" xmlns:w16du="http://schemas.microsoft.com/office/word/2023/wordml/word16du" xmlns:w16sdtdh="http://schemas.microsoft.com/office/word/2020/wordml/sdtdatahash" xmlns:w16sdtfl="http://schemas.microsoft.com/office/word/2024/wordml/sdtformatlock" xmlns:w16se="http://schemas.microsoft.com/office/word/2015/wordml/symex" xmlns:wpg="http://schemas.microsoft.com/office/word/2010/wordprocessingGroup" xmlns:wpi="http://schemas.microsoft.com/office/word/2010/wordprocessingInk" xmlns:wne="http://schemas.microsoft.com/office/word/2006/wordml" xmlns:wps="http://schemas.microsoft.com/office/word/2010/wordprocessingShape" mc:Ignorable="w14 w15 w16se w16cid w16 w16cex w16sdtdh w16sdtfl w16du wp14">
+<w:document xmlns:wpc="http://schemas.microsoft.com/office/word/2010/wordprocessingCanvas" xmlns:cx="http://schemas.microsoft.com/office/drawing/2014/chartex" xmlns:cx1="http://schemas.microsoft.com/office/drawing/2015/9/8/chartex" xmlns:cx2="http://schemas.microsoft.com/office/drawing/2015/10/21/chartex" xmlns:cx3="http://schemas.microsoft.com/office/drawing/2016/5/9/chartex" xmlns:cx4="http://schemas.microsoft.com/office/drawing/2016/5/10/chartex" xmlns:cx5="http://schemas.microsoft.com/office/drawing/2016/5/11/chartex" xmlns:cx6="http://schemas.microsoft.com/office/drawing/2016/5/12/chartex" xmlns:cx7="http://schemas.microsoft.com/office/drawing/2016/5/13/chartex" xmlns:cx8="http://schemas.microsoft.com/office/drawing/2016/5/14/chartex" xmlns:mc="http://schemas.openxmlformats.org/markup-compatibility/2006" xmlns:m="http://schemas.openxmlformats.org/officeDocument/2006/math" xmlns:aink="http://schemas.microsoft.com/office/drawing/2016/ink" xmlns:am3d="http://schemas.microsoft.com/office/drawing/2017/model3d" xmlns:oel="http://schemas.microsoft.com/office/2019/extlst" xmlns:r="http://schemas.openxmlformats.org/officeDocument/2006/relationships" xmlns:wp14="http://schemas.microsoft.com/office/word/2010/wordprocessingDrawing" xmlns:wp="http://schemas.openxmlformats.org/drawingml/2006/wordprocessingDrawing" xmlns:wpg="http://schemas.microsoft.com/office/word/2010/wordprocessingGroup" xmlns:wpi="http://schemas.microsoft.com/office/word/2010/wordprocessingInk" xmlns:wps="http://schemas.microsoft.com/office/word/2010/wordprocessingShape" xmlns:o="urn:schemas-microsoft-com:office:office" xmlns:v="urn:schemas-microsoft-com:vml" xmlns:w10="urn:schemas-microsoft-com:office:word" xmlns:w="http://schemas.openxmlformats.org/wordprocessingml/2006/main" xmlns:w14="http://schemas.microsoft.com/office/word/2010/wordml" xmlns:w15="http://schemas.microsoft.com/office/word/2012/wordml" xmlns:w16cei="http://schemas.microsoft.com/office/word/2026/wordml/cei" xmlns:w16cex="http://schemas.microsoft.com/office/word/2018/wordml/cex" xmlns:w16cid="http://schemas.microsoft.com/office/word/2016/wordml/cid" xmlns:w16="http://schemas.microsoft.com/office/word/2018/wordml" xmlns:w16sdtdh="http://schemas.microsoft.com/office/word/2020/wordml/sdtdatahash" xmlns:w16sdtfl="http://schemas.microsoft.com/office/word/2024/wordml/sdtformatlock" xmlns:w16se="http://schemas.microsoft.com/office/word/2015/wordml/symex" xmlns:w16du="http://schemas.microsoft.com/office/word/2023/wordml/word16du" xmlns:wne="http://schemas.microsoft.com/office/word/2006/wordml" mc:Ignorable="w14 w15 w16se w16cid w16 w16cex w16sdtdh w16sdtfl w16du wp14">
   <w:body>
     <w:p>
       <w:pPr>
@@ -5568,8 +5568,6 @@
         <w:t>on is to open the terminal (Power Shell on Windows) and type this command.</w:t>
       </w:r>
     </w:p>
-    <w:bookmarkStart w:id="34" w:name="_Toc92701398"/>
-    <w:bookmarkStart w:id="35" w:name="_Toc198280706"/>
     <w:p>
       <w:pPr>
         <w:pStyle w:val="Heading3"/>
@@ -5580,6 +5578,8 @@
           <w:szCs w:val="20"/>
         </w:rPr>
       </w:pPr>
+      <w:bookmarkStart w:id="34" w:name="_Toc92701398"/>
+      <w:bookmarkStart w:id="35" w:name="_Toc198280706"/>
       <w:r>
         <w:rPr>
           <w:noProof/>
@@ -6996,12 +6996,12 @@
         <w:t>.</w:t>
       </w:r>
     </w:p>
-    <w:bookmarkStart w:id="46" w:name="_Toc92701404"/>
-    <w:bookmarkStart w:id="47" w:name="_Toc198280712"/>
     <w:p>
       <w:pPr>
         <w:pStyle w:val="Heading2"/>
       </w:pPr>
+      <w:bookmarkStart w:id="46" w:name="_Toc92701404"/>
+      <w:bookmarkStart w:id="47" w:name="_Toc198280712"/>
       <w:r>
         <w:rPr>
           <w:noProof/>
@@ -9967,7 +9967,7 @@
           <w:noProof/>
         </w:rPr>
         <w:drawing>
-          <wp:inline distT="0" distB="0" distL="0" distR="0" wp14:anchorId="1AC2F528" wp14:editId="6B26422C">
+          <wp:inline distT="0" distB="0" distL="0" distR="0" wp14:anchorId="1AC2F528" wp14:editId="26F829CF">
             <wp:extent cx="5012055" cy="637292"/>
             <wp:effectExtent l="0" t="0" r="0" b="0"/>
             <wp:docPr id="5" name="Picture 5" descr="Graphical user interface, text, application&#10;&#10;Description automatically generated"/>
@@ -10649,24 +10649,6 @@
     <w:p>
       <w:pPr>
         <w:shd w:val="clear" w:color="auto" w:fill="333333"/>
-        <w:tabs>
-          <w:tab w:val="left" w:pos="916"/>
-          <w:tab w:val="left" w:pos="1832"/>
-          <w:tab w:val="left" w:pos="2748"/>
-          <w:tab w:val="left" w:pos="3664"/>
-          <w:tab w:val="left" w:pos="4580"/>
-          <w:tab w:val="left" w:pos="5496"/>
-          <w:tab w:val="left" w:pos="6412"/>
-          <w:tab w:val="left" w:pos="7328"/>
-          <w:tab w:val="left" w:pos="8244"/>
-          <w:tab w:val="left" w:pos="9160"/>
-          <w:tab w:val="left" w:pos="10076"/>
-          <w:tab w:val="left" w:pos="10992"/>
-          <w:tab w:val="left" w:pos="11908"/>
-          <w:tab w:val="left" w:pos="12824"/>
-          <w:tab w:val="left" w:pos="13740"/>
-          <w:tab w:val="left" w:pos="14656"/>
-        </w:tabs>
         <w:rPr>
           <w:rFonts w:ascii="Cordia New" w:hAnsi="Cordia New" w:cs="Cordia New"/>
           <w:color w:val="FFFFFF" w:themeColor="background1"/>
@@ -10674,15 +10656,7 @@
           <w:szCs w:val="15"/>
         </w:rPr>
       </w:pPr>
-      <w:r>
-        <w:rPr>
-          <w:rFonts w:ascii="Cordia New" w:hAnsi="Cordia New" w:cs="Cordia New" w:hint="cs"/>
-          <w:color w:val="FFFFFF" w:themeColor="background1"/>
-          <w:sz w:val="15"/>
-          <w:szCs w:val="15"/>
-        </w:rPr>
-        <w:t>{</w:t>
-      </w:r>
+      <w:bookmarkStart w:id="64" w:name="OLE_LINK3"/>
       <w:r>
         <w:rPr>
           <w:rFonts w:ascii="Cordia New" w:hAnsi="Cordia New" w:cs="Cordia New"/>
@@ -10690,26 +10664,19 @@
           <w:sz w:val="15"/>
           <w:szCs w:val="15"/>
         </w:rPr>
-        <w:br/>
-      </w:r>
-      <w:r>
-        <w:rPr>
-          <w:rFonts w:ascii="Cordia New" w:hAnsi="Cordia New" w:cs="Cordia New" w:hint="cs"/>
-          <w:color w:val="FFFFFF" w:themeColor="background1"/>
-          <w:sz w:val="15"/>
-          <w:szCs w:val="15"/>
-        </w:rPr>
-        <w:t xml:space="preserve">  "description": "Token for </w:t>
-      </w:r>
-      <w:r>
+        <w:t>{</w:t>
+      </w:r>
+    </w:p>
+    <w:p>
+      <w:pPr>
+        <w:shd w:val="clear" w:color="auto" w:fill="333333"/>
         <w:rPr>
           <w:rFonts w:ascii="Cordia New" w:hAnsi="Cordia New" w:cs="Cordia New"/>
           <w:color w:val="FFFFFF" w:themeColor="background1"/>
           <w:sz w:val="15"/>
           <w:szCs w:val="15"/>
         </w:rPr>
-        <w:t xml:space="preserve">XIQ-AD-PPSK-Sync.py </w:t>
-      </w:r>
+      </w:pPr>
       <w:r>
         <w:rPr>
           <w:rFonts w:ascii="Cordia New" w:hAnsi="Cordia New" w:cs="Cordia New"/>
@@ -10717,17 +10684,9 @@
           <w:sz w:val="15"/>
           <w:szCs w:val="15"/>
         </w:rPr>
-        <w:t xml:space="preserve"> script</w:t>
-      </w:r>
-      <w:r>
-        <w:rPr>
-          <w:rFonts w:ascii="Cordia New" w:hAnsi="Cordia New" w:cs="Cordia New" w:hint="cs"/>
-          <w:color w:val="FFFFFF" w:themeColor="background1"/>
-          <w:sz w:val="15"/>
-          <w:szCs w:val="15"/>
-        </w:rPr>
-        <w:t>",</w:t>
-      </w:r>
+        <w:t xml:space="preserve">  "description": "Token for </w:t>
+      </w:r>
+      <w:proofErr w:type="gramStart"/>
       <w:r>
         <w:rPr>
           <w:rFonts w:ascii="Cordia New" w:hAnsi="Cordia New" w:cs="Cordia New"/>
@@ -10735,37 +10694,9 @@
           <w:sz w:val="15"/>
           <w:szCs w:val="15"/>
         </w:rPr>
-        <w:br/>
-      </w:r>
-      <w:r>
-        <w:rPr>
-          <w:rFonts w:ascii="Cordia New" w:hAnsi="Cordia New" w:cs="Cordia New" w:hint="cs"/>
-          <w:color w:val="FFFFFF" w:themeColor="background1"/>
-          <w:sz w:val="15"/>
-          <w:szCs w:val="15"/>
-        </w:rPr>
-        <w:t xml:space="preserve">  "</w:t>
-      </w:r>
-      <w:proofErr w:type="spellStart"/>
-      <w:r>
-        <w:rPr>
-          <w:rFonts w:ascii="Cordia New" w:hAnsi="Cordia New" w:cs="Cordia New" w:hint="cs"/>
-          <w:color w:val="FFFFFF" w:themeColor="background1"/>
-          <w:sz w:val="15"/>
-          <w:szCs w:val="15"/>
-        </w:rPr>
-        <w:t>expire_time</w:t>
-      </w:r>
-      <w:proofErr w:type="spellEnd"/>
-      <w:r>
-        <w:rPr>
-          <w:rFonts w:ascii="Cordia New" w:hAnsi="Cordia New" w:cs="Cordia New" w:hint="cs"/>
-          <w:color w:val="FFFFFF" w:themeColor="background1"/>
-          <w:sz w:val="15"/>
-          <w:szCs w:val="15"/>
-        </w:rPr>
-        <w:t xml:space="preserve">": </w:t>
-      </w:r>
+        <w:t>XIQ-AD-PPSK-Sync.py  script</w:t>
+      </w:r>
+      <w:proofErr w:type="gramEnd"/>
       <w:r>
         <w:rPr>
           <w:rFonts w:ascii="Cordia New" w:hAnsi="Cordia New" w:cs="Cordia New"/>
@@ -10773,36 +10704,19 @@
           <w:sz w:val="15"/>
           <w:szCs w:val="15"/>
         </w:rPr>
-        <w:t>1628186428</w:t>
-      </w:r>
-      <w:r>
-        <w:rPr>
-          <w:rFonts w:ascii="Cordia New" w:hAnsi="Cordia New" w:cs="Cordia New" w:hint="cs"/>
-          <w:color w:val="FFFFFF" w:themeColor="background1"/>
-          <w:sz w:val="15"/>
-          <w:szCs w:val="15"/>
-        </w:rPr>
-        <w:t>,</w:t>
-      </w:r>
-      <w:r>
+        <w:t>",</w:t>
+      </w:r>
+    </w:p>
+    <w:p>
+      <w:pPr>
+        <w:shd w:val="clear" w:color="auto" w:fill="333333"/>
         <w:rPr>
           <w:rFonts w:ascii="Cordia New" w:hAnsi="Cordia New" w:cs="Cordia New"/>
           <w:color w:val="FFFFFF" w:themeColor="background1"/>
           <w:sz w:val="15"/>
           <w:szCs w:val="15"/>
         </w:rPr>
-        <w:br/>
-        <w:t xml:space="preserve">  </w:t>
-      </w:r>
-      <w:r>
-        <w:rPr>
-          <w:rFonts w:ascii="Cordia New" w:hAnsi="Cordia New" w:cs="Cordia New" w:hint="cs"/>
-          <w:color w:val="FFFFFF" w:themeColor="background1"/>
-          <w:sz w:val="15"/>
-          <w:szCs w:val="15"/>
-        </w:rPr>
-        <w:t>"permissions": [</w:t>
-      </w:r>
+      </w:pPr>
       <w:r>
         <w:rPr>
           <w:rFonts w:ascii="Cordia New" w:hAnsi="Cordia New" w:cs="Cordia New"/>
@@ -10810,18 +10724,10 @@
           <w:sz w:val="15"/>
           <w:szCs w:val="15"/>
         </w:rPr>
-        <w:br/>
-      </w:r>
-      <w:r>
-        <w:rPr>
-          <w:rFonts w:ascii="Cordia New" w:hAnsi="Cordia New" w:cs="Cordia New" w:hint="cs"/>
-          <w:color w:val="FFFFFF" w:themeColor="background1"/>
-          <w:sz w:val="15"/>
-          <w:szCs w:val="15"/>
-        </w:rPr>
         <w:t xml:space="preserve">  "</w:t>
       </w:r>
       <w:proofErr w:type="spellStart"/>
+      <w:proofErr w:type="gramStart"/>
       <w:r>
         <w:rPr>
           <w:rFonts w:ascii="Cordia New" w:hAnsi="Cordia New" w:cs="Cordia New"/>
@@ -10829,9 +10735,9 @@
           <w:sz w:val="15"/>
           <w:szCs w:val="15"/>
         </w:rPr>
-        <w:t>enduser</w:t>
-      </w:r>
-      <w:proofErr w:type="spellEnd"/>
+        <w:t>expire</w:t>
+      </w:r>
+      <w:proofErr w:type="gramEnd"/>
       <w:r>
         <w:rPr>
           <w:rFonts w:ascii="Cordia New" w:hAnsi="Cordia New" w:cs="Cordia New"/>
@@ -10839,8 +10745,9 @@
           <w:sz w:val="15"/>
           <w:szCs w:val="15"/>
         </w:rPr>
-        <w:t>”</w:t>
-      </w:r>
+        <w:t>_time</w:t>
+      </w:r>
+      <w:proofErr w:type="spellEnd"/>
       <w:r>
         <w:rPr>
           <w:rFonts w:ascii="Cordia New" w:hAnsi="Cordia New" w:cs="Cordia New"/>
@@ -10848,19 +10755,19 @@
           <w:sz w:val="15"/>
           <w:szCs w:val="15"/>
         </w:rPr>
-        <w:t>,</w:t>
-      </w:r>
-      <w:r>
+        <w:t>": 1628186428,</w:t>
+      </w:r>
+    </w:p>
+    <w:p>
+      <w:pPr>
+        <w:shd w:val="clear" w:color="auto" w:fill="333333"/>
         <w:rPr>
           <w:rFonts w:ascii="Cordia New" w:hAnsi="Cordia New" w:cs="Cordia New"/>
           <w:color w:val="FFFFFF" w:themeColor="background1"/>
           <w:sz w:val="15"/>
           <w:szCs w:val="15"/>
         </w:rPr>
-        <w:br/>
-        <w:t xml:space="preserve">  “</w:t>
-      </w:r>
-      <w:proofErr w:type="spellStart"/>
+      </w:pPr>
       <w:r>
         <w:rPr>
           <w:rFonts w:ascii="Cordia New" w:hAnsi="Cordia New" w:cs="Cordia New"/>
@@ -10868,18 +10775,19 @@
           <w:sz w:val="15"/>
           <w:szCs w:val="15"/>
         </w:rPr>
-        <w:t>pcg:key</w:t>
-      </w:r>
-      <w:proofErr w:type="spellEnd"/>
-      <w:r>
+        <w:t xml:space="preserve">  "permissions": [</w:t>
+      </w:r>
+    </w:p>
+    <w:p>
+      <w:pPr>
+        <w:shd w:val="clear" w:color="auto" w:fill="333333"/>
         <w:rPr>
           <w:rFonts w:ascii="Cordia New" w:hAnsi="Cordia New" w:cs="Cordia New"/>
           <w:color w:val="FFFFFF" w:themeColor="background1"/>
           <w:sz w:val="15"/>
           <w:szCs w:val="15"/>
         </w:rPr>
-        <w:t>”</w:t>
-      </w:r>
+      </w:pPr>
       <w:r>
         <w:rPr>
           <w:rFonts w:ascii="Cordia New" w:hAnsi="Cordia New" w:cs="Cordia New"/>
@@ -10887,18 +10795,9 @@
           <w:sz w:val="15"/>
           <w:szCs w:val="15"/>
         </w:rPr>
-        <w:br/>
-        <w:t xml:space="preserve">  </w:t>
-      </w:r>
-      <w:r>
-        <w:rPr>
-          <w:rFonts w:ascii="Cordia New" w:hAnsi="Cordia New" w:cs="Cordia New" w:hint="cs"/>
-          <w:color w:val="FFFFFF" w:themeColor="background1"/>
-          <w:sz w:val="15"/>
-          <w:szCs w:val="15"/>
-        </w:rPr>
-        <w:t>]</w:t>
-      </w:r>
+        <w:t xml:space="preserve">  "</w:t>
+      </w:r>
+      <w:proofErr w:type="spellStart"/>
       <w:r>
         <w:rPr>
           <w:rFonts w:ascii="Cordia New" w:hAnsi="Cordia New" w:cs="Cordia New"/>
@@ -10906,21 +10805,93 @@
           <w:sz w:val="15"/>
           <w:szCs w:val="15"/>
         </w:rPr>
-        <w:br/>
-      </w:r>
-      <w:r>
-        <w:rPr>
-          <w:rFonts w:ascii="Cordia New" w:hAnsi="Cordia New" w:cs="Cordia New" w:hint="cs"/>
+        <w:t>enduser</w:t>
+      </w:r>
+      <w:proofErr w:type="spellEnd"/>
+      <w:r>
+        <w:rPr>
+          <w:rFonts w:ascii="Cordia New" w:hAnsi="Cordia New" w:cs="Cordia New"/>
           <w:color w:val="FFFFFF" w:themeColor="background1"/>
           <w:sz w:val="15"/>
           <w:szCs w:val="15"/>
         </w:rPr>
-        <w:t>}</w:t>
-      </w:r>
-    </w:p>
-    <w:p>
-      <w:pPr>
-        <w:shd w:val="clear" w:color="auto" w:fill="FFFFFF"/>
+        <w:t>",</w:t>
+      </w:r>
+    </w:p>
+    <w:p>
+      <w:pPr>
+        <w:shd w:val="clear" w:color="auto" w:fill="333333"/>
+        <w:rPr>
+          <w:rFonts w:ascii="Cordia New" w:hAnsi="Cordia New" w:cs="Cordia New"/>
+          <w:color w:val="FFFFFF" w:themeColor="background1"/>
+          <w:sz w:val="15"/>
+          <w:szCs w:val="15"/>
+        </w:rPr>
+      </w:pPr>
+      <w:r>
+        <w:rPr>
+          <w:rFonts w:ascii="Cordia New" w:hAnsi="Cordia New" w:cs="Cordia New"/>
+          <w:color w:val="FFFFFF" w:themeColor="background1"/>
+          <w:sz w:val="15"/>
+          <w:szCs w:val="15"/>
+        </w:rPr>
+        <w:t xml:space="preserve">  "</w:t>
+      </w:r>
+      <w:proofErr w:type="spellStart"/>
+      <w:proofErr w:type="gramStart"/>
+      <w:r>
+        <w:rPr>
+          <w:rFonts w:ascii="Cordia New" w:hAnsi="Cordia New" w:cs="Cordia New"/>
+          <w:color w:val="FFFFFF" w:themeColor="background1"/>
+          <w:sz w:val="15"/>
+          <w:szCs w:val="15"/>
+        </w:rPr>
+        <w:t>pcg</w:t>
+      </w:r>
+      <w:proofErr w:type="gramEnd"/>
+      <w:r>
+        <w:rPr>
+          <w:rFonts w:ascii="Cordia New" w:hAnsi="Cordia New" w:cs="Cordia New"/>
+          <w:color w:val="FFFFFF" w:themeColor="background1"/>
+          <w:sz w:val="15"/>
+          <w:szCs w:val="15"/>
+        </w:rPr>
+        <w:t>:key</w:t>
+      </w:r>
+      <w:proofErr w:type="spellEnd"/>
+      <w:r>
+        <w:rPr>
+          <w:rFonts w:ascii="Cordia New" w:hAnsi="Cordia New" w:cs="Cordia New"/>
+          <w:color w:val="FFFFFF" w:themeColor="background1"/>
+          <w:sz w:val="15"/>
+          <w:szCs w:val="15"/>
+        </w:rPr>
+        <w:t>"</w:t>
+      </w:r>
+    </w:p>
+    <w:p>
+      <w:pPr>
+        <w:shd w:val="clear" w:color="auto" w:fill="333333"/>
+        <w:rPr>
+          <w:rFonts w:ascii="Cordia New" w:hAnsi="Cordia New" w:cs="Cordia New"/>
+          <w:color w:val="FFFFFF" w:themeColor="background1"/>
+          <w:sz w:val="15"/>
+          <w:szCs w:val="15"/>
+        </w:rPr>
+      </w:pPr>
+      <w:r>
+        <w:rPr>
+          <w:rFonts w:ascii="Cordia New" w:hAnsi="Cordia New" w:cs="Cordia New"/>
+          <w:color w:val="FFFFFF" w:themeColor="background1"/>
+          <w:sz w:val="15"/>
+          <w:szCs w:val="15"/>
+        </w:rPr>
+        <w:t xml:space="preserve">  ]</w:t>
+      </w:r>
+    </w:p>
+    <w:p>
+      <w:pPr>
+        <w:shd w:val="clear" w:color="auto" w:fill="333333"/>
         <w:rPr>
           <w:rFonts w:asciiTheme="majorHAnsi" w:hAnsiTheme="majorHAnsi" w:cstheme="majorHAnsi"/>
           <w:i/>
@@ -10930,7 +10901,17 @@
           <w:szCs w:val="15"/>
         </w:rPr>
       </w:pPr>
-    </w:p>
+      <w:r>
+        <w:rPr>
+          <w:rFonts w:ascii="Cordia New" w:hAnsi="Cordia New" w:cs="Cordia New"/>
+          <w:color w:val="FFFFFF" w:themeColor="background1"/>
+          <w:sz w:val="15"/>
+          <w:szCs w:val="15"/>
+        </w:rPr>
+        <w:t>}</w:t>
+      </w:r>
+    </w:p>
+    <w:bookmarkEnd w:id="64"/>
     <w:p>
       <w:pPr>
         <w:shd w:val="clear" w:color="auto" w:fill="FFFFFF"/>
@@ -12203,9 +12184,9 @@
           <w:szCs w:val="24"/>
         </w:rPr>
       </w:pPr>
-      <w:bookmarkStart w:id="64" w:name="_AD_Group_Distinguished"/>
-      <w:bookmarkStart w:id="65" w:name="_Toc87020364"/>
-      <w:bookmarkEnd w:id="64"/>
+      <w:bookmarkStart w:id="65" w:name="_AD_Group_Distinguished"/>
+      <w:bookmarkStart w:id="66" w:name="_Toc87020364"/>
+      <w:bookmarkEnd w:id="65"/>
       <w:r>
         <w:rPr>
           <w:sz w:val="24"/>
@@ -12222,9 +12203,9 @@
           <w:szCs w:val="24"/>
         </w:rPr>
       </w:pPr>
-      <w:bookmarkStart w:id="66" w:name="_AD_Group_Distinguished_1"/>
-      <w:bookmarkStart w:id="67" w:name="_Toc198280720"/>
-      <w:bookmarkEnd w:id="66"/>
+      <w:bookmarkStart w:id="67" w:name="_AD_Group_Distinguished_1"/>
+      <w:bookmarkStart w:id="68" w:name="_Toc198280720"/>
+      <w:bookmarkEnd w:id="67"/>
       <w:r>
         <w:rPr>
           <w:sz w:val="24"/>
@@ -12247,8 +12228,8 @@
         </w:rPr>
         <w:t>istinguished Name</w:t>
       </w:r>
-      <w:bookmarkEnd w:id="65"/>
-      <w:bookmarkEnd w:id="67"/>
+      <w:bookmarkEnd w:id="66"/>
+      <w:bookmarkEnd w:id="68"/>
     </w:p>
     <w:p/>
     <w:p>
@@ -12305,7 +12286,7 @@
           <w:noProof/>
         </w:rPr>
         <w:drawing>
-          <wp:anchor distT="0" distB="0" distL="114300" distR="114300" simplePos="0" relativeHeight="251665408" behindDoc="1" locked="0" layoutInCell="1" allowOverlap="1" wp14:anchorId="53DDA881" wp14:editId="07308335">
+          <wp:anchor distT="0" distB="0" distL="114300" distR="114300" simplePos="0" relativeHeight="251665408" behindDoc="1" locked="0" layoutInCell="1" allowOverlap="1" wp14:anchorId="53DDA881" wp14:editId="79AE18BE">
             <wp:simplePos x="0" y="0"/>
             <wp:positionH relativeFrom="column">
               <wp:posOffset>3556000</wp:posOffset>
@@ -12744,8 +12725,8 @@
       </w:r>
     </w:p>
     <w:p>
-      <w:bookmarkStart w:id="68" w:name="_AD_Filter"/>
-      <w:bookmarkEnd w:id="68"/>
+      <w:bookmarkStart w:id="69" w:name="_AD_Filter"/>
+      <w:bookmarkEnd w:id="69"/>
     </w:p>
     <w:p>
       <w:pPr>
@@ -12755,10 +12736,10 @@
           <w:szCs w:val="24"/>
         </w:rPr>
       </w:pPr>
-      <w:bookmarkStart w:id="69" w:name="_XIQ_User_Group"/>
-      <w:bookmarkStart w:id="70" w:name="_Toc87020365"/>
-      <w:bookmarkStart w:id="71" w:name="_Toc198280721"/>
-      <w:bookmarkEnd w:id="69"/>
+      <w:bookmarkStart w:id="70" w:name="_XIQ_User_Group"/>
+      <w:bookmarkStart w:id="71" w:name="_Toc87020365"/>
+      <w:bookmarkStart w:id="72" w:name="_Toc198280721"/>
+      <w:bookmarkEnd w:id="70"/>
       <w:r>
         <w:rPr>
           <w:sz w:val="24"/>
@@ -12766,8 +12747,8 @@
         </w:rPr>
         <w:t>XIQ User Group ID</w:t>
       </w:r>
-      <w:bookmarkEnd w:id="70"/>
       <w:bookmarkEnd w:id="71"/>
+      <w:bookmarkEnd w:id="72"/>
     </w:p>
     <w:p/>
     <w:p>
@@ -12859,7 +12840,7 @@
           <w:noProof/>
         </w:rPr>
         <w:drawing>
-          <wp:inline distT="0" distB="0" distL="0" distR="0" wp14:anchorId="4F2449D0" wp14:editId="6EDBF41A">
+          <wp:inline distT="0" distB="0" distL="0" distR="0" wp14:anchorId="4F2449D0" wp14:editId="252AE55E">
             <wp:extent cx="6492240" cy="248285"/>
             <wp:effectExtent l="0" t="0" r="0" b="5715"/>
             <wp:docPr id="13" name="Picture 13"/>
@@ -14602,16 +14583,16 @@
           <w:szCs w:val="24"/>
         </w:rPr>
       </w:pPr>
-      <w:bookmarkStart w:id="72" w:name="_XIQ_Network_Policy"/>
-      <w:bookmarkStart w:id="73" w:name="_Toc198280722"/>
-      <w:bookmarkEnd w:id="72"/>
+      <w:bookmarkStart w:id="73" w:name="_XIQ_Network_Policy"/>
+      <w:bookmarkStart w:id="74" w:name="_Toc198280722"/>
+      <w:bookmarkEnd w:id="73"/>
       <w:r>
         <w:rPr>
           <w:rFonts w:asciiTheme="minorHAnsi" w:hAnsiTheme="minorHAnsi" w:cstheme="minorHAnsi"/>
           <w:noProof/>
         </w:rPr>
         <w:drawing>
-          <wp:anchor distT="0" distB="0" distL="114300" distR="114300" simplePos="0" relativeHeight="251720704" behindDoc="1" locked="0" layoutInCell="1" allowOverlap="1" wp14:anchorId="6DBF61F4" wp14:editId="49697C8C">
+          <wp:anchor distT="0" distB="0" distL="114300" distR="114300" simplePos="0" relativeHeight="251720704" behindDoc="1" locked="0" layoutInCell="1" allowOverlap="1" wp14:anchorId="6DBF61F4" wp14:editId="6231A244">
             <wp:simplePos x="0" y="0"/>
             <wp:positionH relativeFrom="column">
               <wp:posOffset>3835400</wp:posOffset>
@@ -14695,7 +14676,7 @@
         </w:rPr>
         <w:t xml:space="preserve"> ID</w:t>
       </w:r>
-      <w:bookmarkEnd w:id="73"/>
+      <w:bookmarkEnd w:id="74"/>
       <w:r>
         <w:rPr>
           <w:sz w:val="24"/>
@@ -16028,10 +16009,10 @@
           <w:szCs w:val="24"/>
         </w:rPr>
       </w:pPr>
-      <w:bookmarkStart w:id="74" w:name="_AD_Filter_1"/>
-      <w:bookmarkStart w:id="75" w:name="_Toc198280723"/>
-      <w:bookmarkStart w:id="76" w:name="_Toc87020367"/>
-      <w:bookmarkEnd w:id="74"/>
+      <w:bookmarkStart w:id="75" w:name="_AD_Filter_1"/>
+      <w:bookmarkStart w:id="76" w:name="_Toc198280723"/>
+      <w:bookmarkStart w:id="77" w:name="_Toc87020367"/>
+      <w:bookmarkEnd w:id="75"/>
       <w:r>
         <w:rPr>
           <w:sz w:val="24"/>
@@ -16046,7 +16027,7 @@
         </w:rPr>
         <w:t>Filter</w:t>
       </w:r>
-      <w:bookmarkEnd w:id="75"/>
+      <w:bookmarkEnd w:id="76"/>
     </w:p>
     <w:p>
       <w:pPr>
@@ -16188,12 +16169,12 @@
           <w:szCs w:val="24"/>
         </w:rPr>
       </w:pPr>
-      <w:bookmarkStart w:id="77" w:name="_Active_Directory_Disable"/>
-      <w:bookmarkStart w:id="78" w:name="_Active_Directory_Disable_1"/>
-      <w:bookmarkStart w:id="79" w:name="_Toc87020366"/>
-      <w:bookmarkStart w:id="80" w:name="_Toc198280724"/>
-      <w:bookmarkEnd w:id="77"/>
+      <w:bookmarkStart w:id="78" w:name="_Active_Directory_Disable"/>
+      <w:bookmarkStart w:id="79" w:name="_Active_Directory_Disable_1"/>
+      <w:bookmarkStart w:id="80" w:name="_Toc87020366"/>
+      <w:bookmarkStart w:id="81" w:name="_Toc198280724"/>
       <w:bookmarkEnd w:id="78"/>
+      <w:bookmarkEnd w:id="79"/>
       <w:r>
         <w:rPr>
           <w:sz w:val="24"/>
@@ -16201,8 +16182,8 @@
         </w:rPr>
         <w:t>Active Directory Disable Codes</w:t>
       </w:r>
-      <w:bookmarkEnd w:id="79"/>
       <w:bookmarkEnd w:id="80"/>
+      <w:bookmarkEnd w:id="81"/>
     </w:p>
     <w:p/>
     <w:p>
@@ -16779,13 +16760,13 @@
       <w:pPr>
         <w:pStyle w:val="Heading1"/>
       </w:pPr>
-      <w:bookmarkStart w:id="81" w:name="_Toc198280725"/>
+      <w:bookmarkStart w:id="82" w:name="_Toc198280725"/>
       <w:r>
         <w:lastRenderedPageBreak/>
         <w:t>Running the Script:</w:t>
       </w:r>
-      <w:bookmarkEnd w:id="76"/>
-      <w:bookmarkEnd w:id="81"/>
+      <w:bookmarkEnd w:id="77"/>
+      <w:bookmarkEnd w:id="82"/>
     </w:p>
     <w:p>
       <w:pPr>
@@ -17489,7 +17470,7 @@
       <w:pPr>
         <w:pStyle w:val="Heading2"/>
       </w:pPr>
-      <w:bookmarkStart w:id="82" w:name="_Toc198280726"/>
+      <w:bookmarkStart w:id="83" w:name="_Toc198280726"/>
       <w:r>
         <w:rPr>
           <w:rFonts w:hint="cs"/>
@@ -17562,7 +17543,7 @@
       <w:r>
         <w:t>Log File</w:t>
       </w:r>
-      <w:bookmarkEnd w:id="82"/>
+      <w:bookmarkEnd w:id="83"/>
     </w:p>
     <w:p>
       <w:pPr>
@@ -17631,7 +17612,7 @@
       <w:pPr>
         <w:pStyle w:val="Heading1"/>
       </w:pPr>
-      <w:bookmarkStart w:id="83" w:name="_Toc198280727"/>
+      <w:bookmarkStart w:id="84" w:name="_Toc198280727"/>
       <w:r>
         <w:t xml:space="preserve">Scheduling </w:t>
       </w:r>
@@ -17647,7 +17628,7 @@
       <w:r>
         <w:t>un</w:t>
       </w:r>
-      <w:bookmarkEnd w:id="83"/>
+      <w:bookmarkEnd w:id="84"/>
     </w:p>
     <w:p>
       <w:pPr>
@@ -17657,7 +17638,7 @@
           <w:bCs/>
         </w:rPr>
       </w:pPr>
-      <w:bookmarkStart w:id="84" w:name="_Toc198280728"/>
+      <w:bookmarkStart w:id="85" w:name="_Toc198280728"/>
       <w:r>
         <w:rPr>
           <w:b w:val="0"/>
@@ -17679,7 +17660,7 @@
         </w:rPr>
         <w:t>based Systems</w:t>
       </w:r>
-      <w:bookmarkEnd w:id="84"/>
+      <w:bookmarkEnd w:id="85"/>
     </w:p>
     <w:p>
       <w:pPr>
@@ -17800,7 +17781,7 @@
           <w:szCs w:val="20"/>
         </w:rPr>
       </w:pPr>
-      <w:bookmarkStart w:id="85" w:name="_Toc198280729"/>
+      <w:bookmarkStart w:id="86" w:name="_Toc198280729"/>
       <w:r>
         <w:rPr>
           <w:b w:val="0"/>
@@ -17810,7 +17791,7 @@
         </w:rPr>
         <w:t>Setting up a Cron Job</w:t>
       </w:r>
-      <w:bookmarkEnd w:id="85"/>
+      <w:bookmarkEnd w:id="86"/>
     </w:p>
     <w:p>
       <w:pPr>
@@ -18003,7 +17984,7 @@
           <w:color w:val="7030A0"/>
         </w:rPr>
       </w:pPr>
-      <w:bookmarkStart w:id="86" w:name="_Toc198280730"/>
+      <w:bookmarkStart w:id="87" w:name="_Toc198280730"/>
       <w:r>
         <w:rPr>
           <w:color w:val="7030A0"/>
@@ -18011,7 +17992,7 @@
         <w:lastRenderedPageBreak/>
         <w:t>Cron Job Time Format</w:t>
       </w:r>
-      <w:bookmarkEnd w:id="86"/>
+      <w:bookmarkEnd w:id="87"/>
       <w:r>
         <w:rPr>
           <w:color w:val="7030A0"/>
@@ -18584,7 +18565,7 @@
           <w:color w:val="7030A0"/>
         </w:rPr>
       </w:pPr>
-      <w:bookmarkStart w:id="87" w:name="_Toc198280731"/>
+      <w:bookmarkStart w:id="88" w:name="_Toc198280731"/>
       <w:r>
         <w:rPr>
           <w:color w:val="7030A0"/>
@@ -18603,7 +18584,7 @@
         </w:rPr>
         <w:t xml:space="preserve"> Location</w:t>
       </w:r>
-      <w:bookmarkEnd w:id="87"/>
+      <w:bookmarkEnd w:id="88"/>
     </w:p>
     <w:p>
       <w:pPr>
@@ -18910,23 +18891,13 @@
                           <w:szCs w:val="16"/>
                         </w:rPr>
                       </w:pPr>
-                      <w:proofErr w:type="spellStart"/>
                       <w:r>
                         <w:rPr>
                           <w:rFonts w:ascii="Apple Braille" w:hAnsi="Apple Braille"/>
                           <w:sz w:val="16"/>
                           <w:szCs w:val="16"/>
                         </w:rPr>
-                        <w:t>chmod</w:t>
-                      </w:r>
-                      <w:proofErr w:type="spellEnd"/>
-                      <w:r>
-                        <w:rPr>
-                          <w:rFonts w:ascii="Apple Braille" w:hAnsi="Apple Braille"/>
-                          <w:sz w:val="16"/>
-                          <w:szCs w:val="16"/>
-                        </w:rPr>
-                        <w:t xml:space="preserve"> +x /home/admin/documents/scripts/XIQ-AD-PPSK-Sync.py</w:t>
+                        <w:t>chmod +x /home/admin/documents/scripts/XIQ-AD-PPSK-Sync.py</w:t>
                       </w:r>
                     </w:p>
                   </w:txbxContent>
@@ -19061,14 +19032,14 @@
           <w:color w:val="7030A0"/>
         </w:rPr>
       </w:pPr>
-      <w:bookmarkStart w:id="88" w:name="_Toc198280732"/>
+      <w:bookmarkStart w:id="89" w:name="_Toc198280732"/>
       <w:r>
         <w:rPr>
           <w:color w:val="7030A0"/>
         </w:rPr>
         <w:t>Cron Job Output and Job Completion</w:t>
       </w:r>
-      <w:bookmarkEnd w:id="88"/>
+      <w:bookmarkEnd w:id="89"/>
     </w:p>
     <w:p>
       <w:pPr>
@@ -19474,14 +19445,14 @@
           <w:color w:val="7030A0"/>
         </w:rPr>
       </w:pPr>
-      <w:bookmarkStart w:id="89" w:name="_Toc198280733"/>
+      <w:bookmarkStart w:id="90" w:name="_Toc198280733"/>
       <w:r>
         <w:rPr>
           <w:color w:val="7030A0"/>
         </w:rPr>
         <w:t>Cron Job Command Example</w:t>
       </w:r>
-      <w:bookmarkEnd w:id="89"/>
+      <w:bookmarkEnd w:id="90"/>
     </w:p>
     <w:p>
       <w:pPr>
@@ -19946,7 +19917,7 @@
           <w:bCs/>
         </w:rPr>
       </w:pPr>
-      <w:bookmarkStart w:id="90" w:name="_Toc198280734"/>
+      <w:bookmarkStart w:id="91" w:name="_Toc198280734"/>
       <w:r>
         <w:rPr>
           <w:b w:val="0"/>
@@ -19954,7 +19925,7 @@
         </w:rPr>
         <w:t>Windows based Systems</w:t>
       </w:r>
-      <w:bookmarkEnd w:id="90"/>
+      <w:bookmarkEnd w:id="91"/>
     </w:p>
     <w:p>
       <w:pPr>
@@ -20062,7 +20033,7 @@
           <w:szCs w:val="21"/>
         </w:rPr>
       </w:pPr>
-      <w:bookmarkStart w:id="91" w:name="_Toc198280735"/>
+      <w:bookmarkStart w:id="92" w:name="_Toc198280735"/>
       <w:r>
         <w:rPr>
           <w:b w:val="0"/>
@@ -20072,7 +20043,7 @@
         </w:rPr>
         <w:t>Setting up Windows Task Scheduler</w:t>
       </w:r>
-      <w:bookmarkEnd w:id="91"/>
+      <w:bookmarkEnd w:id="92"/>
     </w:p>
     <w:p>
       <w:pPr>
@@ -20238,14 +20209,14 @@
           <w:color w:val="7030A0"/>
         </w:rPr>
       </w:pPr>
-      <w:bookmarkStart w:id="92" w:name="_Toc198280736"/>
+      <w:bookmarkStart w:id="93" w:name="_Toc198280736"/>
       <w:r>
         <w:rPr>
           <w:color w:val="7030A0"/>
         </w:rPr>
         <w:t>Start a Program</w:t>
       </w:r>
-      <w:bookmarkEnd w:id="92"/>
+      <w:bookmarkEnd w:id="93"/>
     </w:p>
     <w:p>
       <w:pPr>
@@ -20375,7 +20346,6 @@
                           <w:szCs w:val="16"/>
                         </w:rPr>
                       </w:pPr>
-                      <w:proofErr w:type="spellStart"/>
                       <w:r>
                         <w:rPr>
                           <w:rFonts w:ascii="Apple Braille" w:hAnsi="Apple Braille"/>
@@ -20392,7 +20362,6 @@
                         </w:rPr>
                         <w:t>.executable</w:t>
                       </w:r>
-                      <w:proofErr w:type="spellEnd"/>
                     </w:p>
                   </w:txbxContent>
                 </v:textbox>
@@ -20794,7 +20763,7 @@
           <w:noProof/>
         </w:rPr>
         <w:drawing>
-          <wp:anchor distT="0" distB="0" distL="114300" distR="114300" simplePos="0" relativeHeight="251723776" behindDoc="0" locked="0" layoutInCell="1" allowOverlap="1" wp14:anchorId="6B6A9A07" wp14:editId="137D4FC2">
+          <wp:anchor distT="0" distB="0" distL="114300" distR="114300" simplePos="0" relativeHeight="251723776" behindDoc="0" locked="0" layoutInCell="1" allowOverlap="1" wp14:anchorId="6B6A9A07" wp14:editId="51AFD956">
             <wp:simplePos x="0" y="0"/>
             <wp:positionH relativeFrom="column">
               <wp:posOffset>4414793</wp:posOffset>
@@ -21147,7 +21116,7 @@
       <w:r>
         <w:br w:type="page"/>
       </w:r>
-      <w:bookmarkStart w:id="93" w:name="_Toc198280737"/>
+      <w:bookmarkStart w:id="94" w:name="_Toc198280737"/>
       <w:r>
         <w:rPr>
           <w:color w:val="7030A0"/>
@@ -21155,7 +21124,7 @@
         <w:lastRenderedPageBreak/>
         <w:t>Editing the Time</w:t>
       </w:r>
-      <w:bookmarkEnd w:id="93"/>
+      <w:bookmarkEnd w:id="94"/>
     </w:p>
     <w:p>
       <w:r>
@@ -21285,7 +21254,7 @@
       <w:pPr>
         <w:pStyle w:val="Heading1"/>
       </w:pPr>
-      <w:bookmarkStart w:id="94" w:name="_Toc198280738"/>
+      <w:bookmarkStart w:id="95" w:name="_Toc198280738"/>
       <w:r>
         <w:lastRenderedPageBreak/>
         <w:t>Troubl</w:t>
@@ -21296,17 +21265,17 @@
       <w:r>
         <w:t>hooting:</w:t>
       </w:r>
-      <w:bookmarkEnd w:id="94"/>
+      <w:bookmarkEnd w:id="95"/>
     </w:p>
     <w:p>
       <w:pPr>
         <w:pStyle w:val="Heading2"/>
       </w:pPr>
-      <w:bookmarkStart w:id="95" w:name="_Toc198280739"/>
+      <w:bookmarkStart w:id="96" w:name="_Toc198280739"/>
       <w:r>
         <w:t>Log File</w:t>
       </w:r>
-      <w:bookmarkEnd w:id="95"/>
+      <w:bookmarkEnd w:id="96"/>
     </w:p>
     <w:p>
       <w:pPr>
@@ -21350,7 +21319,7 @@
           <w:szCs w:val="20"/>
         </w:rPr>
       </w:pPr>
-      <w:bookmarkStart w:id="96" w:name="_Toc198280740"/>
+      <w:bookmarkStart w:id="97" w:name="_Toc198280740"/>
       <w:r>
         <w:rPr>
           <w:sz w:val="20"/>
@@ -21358,7 +21327,7 @@
         </w:rPr>
         <w:t>Invalid XIQ token</w:t>
       </w:r>
-      <w:bookmarkEnd w:id="96"/>
+      <w:bookmarkEnd w:id="97"/>
     </w:p>
     <w:p>
       <w:pPr>
@@ -21774,7 +21743,7 @@
           <w:szCs w:val="20"/>
         </w:rPr>
       </w:pPr>
-      <w:bookmarkStart w:id="97" w:name="_Toc198280741"/>
+      <w:bookmarkStart w:id="98" w:name="_Toc198280741"/>
       <w:r>
         <w:rPr>
           <w:sz w:val="20"/>
@@ -21782,7 +21751,7 @@
         </w:rPr>
         <w:t>Invalid XIQ token format</w:t>
       </w:r>
-      <w:bookmarkEnd w:id="97"/>
+      <w:bookmarkEnd w:id="98"/>
     </w:p>
     <w:p>
       <w:pPr>
@@ -22266,7 +22235,7 @@
           <w:szCs w:val="20"/>
         </w:rPr>
       </w:pPr>
-      <w:bookmarkStart w:id="98" w:name="_Toc198280742"/>
+      <w:bookmarkStart w:id="99" w:name="_Toc198280742"/>
       <w:r>
         <w:rPr>
           <w:sz w:val="20"/>
@@ -22281,7 +22250,7 @@
         </w:rPr>
         <w:t xml:space="preserve"> – Code 401 &amp; JWT expired</w:t>
       </w:r>
-      <w:bookmarkEnd w:id="98"/>
+      <w:bookmarkEnd w:id="99"/>
     </w:p>
     <w:p>
       <w:pPr>
@@ -22674,7 +22643,7 @@
           <w:szCs w:val="20"/>
         </w:rPr>
       </w:pPr>
-      <w:bookmarkStart w:id="99" w:name="_Toc198280743"/>
+      <w:bookmarkStart w:id="100" w:name="_Toc198280743"/>
       <w:r>
         <w:rPr>
           <w:sz w:val="20"/>
@@ -22689,7 +22658,7 @@
         </w:rPr>
         <w:t xml:space="preserve"> – Code 401</w:t>
       </w:r>
-      <w:bookmarkEnd w:id="99"/>
+      <w:bookmarkEnd w:id="100"/>
     </w:p>
     <w:p>
       <w:pPr>
@@ -22945,7 +22914,7 @@
           <w:szCs w:val="20"/>
         </w:rPr>
       </w:pPr>
-      <w:bookmarkStart w:id="100" w:name="_Toc198280744"/>
+      <w:bookmarkStart w:id="101" w:name="_Toc198280744"/>
       <w:r>
         <w:rPr>
           <w:sz w:val="20"/>
@@ -22960,7 +22929,7 @@
         </w:rPr>
         <w:t xml:space="preserve"> (Active Directory)</w:t>
       </w:r>
-      <w:bookmarkEnd w:id="100"/>
+      <w:bookmarkEnd w:id="101"/>
     </w:p>
     <w:p>
       <w:pPr>
@@ -23115,7 +23084,7 @@
           <w:szCs w:val="20"/>
         </w:rPr>
       </w:pPr>
-      <w:bookmarkStart w:id="101" w:name="_Toc198280745"/>
+      <w:bookmarkStart w:id="102" w:name="_Toc198280745"/>
       <w:r>
         <w:rPr>
           <w:sz w:val="20"/>
@@ -23130,7 +23099,7 @@
         </w:rPr>
         <w:t xml:space="preserve"> – Code 400</w:t>
       </w:r>
-      <w:bookmarkEnd w:id="101"/>
+      <w:bookmarkEnd w:id="102"/>
     </w:p>
     <w:p>
       <w:pPr>
@@ -23950,7 +23919,7 @@
           <w:szCs w:val="20"/>
         </w:rPr>
       </w:pPr>
-      <w:bookmarkStart w:id="102" w:name="_Toc198280746"/>
+      <w:bookmarkStart w:id="103" w:name="_Toc198280746"/>
       <w:r>
         <w:rPr>
           <w:sz w:val="20"/>
@@ -23966,7 +23935,7 @@
         </w:rPr>
         <w:t>Timeout Error</w:t>
       </w:r>
-      <w:bookmarkEnd w:id="102"/>
+      <w:bookmarkEnd w:id="103"/>
     </w:p>
     <w:p>
       <w:r>
@@ -24262,7 +24231,7 @@
           <w:szCs w:val="20"/>
         </w:rPr>
       </w:pPr>
-      <w:bookmarkStart w:id="103" w:name="_Toc198280747"/>
+      <w:bookmarkStart w:id="104" w:name="_Toc198280747"/>
       <w:r>
         <w:rPr>
           <w:sz w:val="20"/>
@@ -24298,7 +24267,7 @@
         </w:rPr>
         <w:t xml:space="preserve"> User</w:t>
       </w:r>
-      <w:bookmarkEnd w:id="103"/>
+      <w:bookmarkEnd w:id="104"/>
     </w:p>
     <w:p>
       <w:pPr>
@@ -24438,13 +24407,13 @@
       <w:pPr>
         <w:pStyle w:val="Heading2"/>
       </w:pPr>
-      <w:bookmarkStart w:id="104" w:name="_AD_Test.py"/>
-      <w:bookmarkStart w:id="105" w:name="_Toc198280748"/>
-      <w:bookmarkEnd w:id="104"/>
+      <w:bookmarkStart w:id="105" w:name="_AD_Test.py"/>
+      <w:bookmarkStart w:id="106" w:name="_Toc198280748"/>
+      <w:bookmarkEnd w:id="105"/>
       <w:r>
         <w:t>AD_Test.py</w:t>
       </w:r>
-      <w:bookmarkEnd w:id="105"/>
+      <w:bookmarkEnd w:id="106"/>
     </w:p>
     <w:p>
       <w:pPr>
@@ -25033,7 +25002,7 @@
 </file>
 
 <file path=word/endnotes.xml><?xml version="1.0" encoding="utf-8"?>
-<w:endnotes xmlns:wpc="http://schemas.microsoft.com/office/word/2010/wordprocessingCanvas" xmlns:cx="http://schemas.microsoft.com/office/drawing/2014/chartex" xmlns:cx1="http://schemas.microsoft.com/office/drawing/2015/9/8/chartex" xmlns:cx2="http://schemas.microsoft.com/office/drawing/2015/10/21/chartex" xmlns:cx3="http://schemas.microsoft.com/office/drawing/2016/5/9/chartex" xmlns:cx4="http://schemas.microsoft.com/office/drawing/2016/5/10/chartex" xmlns:cx5="http://schemas.microsoft.com/office/drawing/2016/5/11/chartex" xmlns:cx6="http://schemas.microsoft.com/office/drawing/2016/5/12/chartex" xmlns:cx7="http://schemas.microsoft.com/office/drawing/2016/5/13/chartex" xmlns:cx8="http://schemas.microsoft.com/office/drawing/2016/5/14/chartex" xmlns:mc="http://schemas.openxmlformats.org/markup-compatibility/2006" xmlns:aink="http://schemas.microsoft.com/office/drawing/2016/ink" xmlns:am3d="http://schemas.microsoft.com/office/drawing/2017/model3d" xmlns:o="urn:schemas-microsoft-com:office:office" xmlns:oel="http://schemas.microsoft.com/office/2019/extlst" xmlns:r="http://schemas.openxmlformats.org/officeDocument/2006/relationships" xmlns:m="http://schemas.openxmlformats.org/officeDocument/2006/math" xmlns:v="urn:schemas-microsoft-com:vml" xmlns:wp14="http://schemas.microsoft.com/office/word/2010/wordprocessingDrawing" xmlns:wp="http://schemas.openxmlformats.org/drawingml/2006/wordprocessingDrawing" xmlns:w10="urn:schemas-microsoft-com:office:word" xmlns:w="http://schemas.openxmlformats.org/wordprocessingml/2006/main" xmlns:w14="http://schemas.microsoft.com/office/word/2010/wordml" xmlns:w15="http://schemas.microsoft.com/office/word/2012/wordml" xmlns:w16cex="http://schemas.microsoft.com/office/word/2018/wordml/cex" xmlns:w16cid="http://schemas.microsoft.com/office/word/2016/wordml/cid" xmlns:w16="http://schemas.microsoft.com/office/word/2018/wordml" xmlns:w16du="http://schemas.microsoft.com/office/word/2023/wordml/word16du" xmlns:w16sdtdh="http://schemas.microsoft.com/office/word/2020/wordml/sdtdatahash" xmlns:w16sdtfl="http://schemas.microsoft.com/office/word/2024/wordml/sdtformatlock" xmlns:w16se="http://schemas.microsoft.com/office/word/2015/wordml/symex" xmlns:wpg="http://schemas.microsoft.com/office/word/2010/wordprocessingGroup" xmlns:wpi="http://schemas.microsoft.com/office/word/2010/wordprocessingInk" xmlns:wne="http://schemas.microsoft.com/office/word/2006/wordml" xmlns:wps="http://schemas.microsoft.com/office/word/2010/wordprocessingShape" mc:Ignorable="w14 w15 w16se w16cid w16 w16cex w16sdtdh w16sdtfl w16du wp14">
+<w:endnotes xmlns:wpc="http://schemas.microsoft.com/office/word/2010/wordprocessingCanvas" xmlns:cx="http://schemas.microsoft.com/office/drawing/2014/chartex" xmlns:cx1="http://schemas.microsoft.com/office/drawing/2015/9/8/chartex" xmlns:cx2="http://schemas.microsoft.com/office/drawing/2015/10/21/chartex" xmlns:cx3="http://schemas.microsoft.com/office/drawing/2016/5/9/chartex" xmlns:cx4="http://schemas.microsoft.com/office/drawing/2016/5/10/chartex" xmlns:cx5="http://schemas.microsoft.com/office/drawing/2016/5/11/chartex" xmlns:cx6="http://schemas.microsoft.com/office/drawing/2016/5/12/chartex" xmlns:cx7="http://schemas.microsoft.com/office/drawing/2016/5/13/chartex" xmlns:cx8="http://schemas.microsoft.com/office/drawing/2016/5/14/chartex" xmlns:mc="http://schemas.openxmlformats.org/markup-compatibility/2006" xmlns:m="http://schemas.openxmlformats.org/officeDocument/2006/math" xmlns:aink="http://schemas.microsoft.com/office/drawing/2016/ink" xmlns:am3d="http://schemas.microsoft.com/office/drawing/2017/model3d" xmlns:oel="http://schemas.microsoft.com/office/2019/extlst" xmlns:r="http://schemas.openxmlformats.org/officeDocument/2006/relationships" xmlns:wp14="http://schemas.microsoft.com/office/word/2010/wordprocessingDrawing" xmlns:wp="http://schemas.openxmlformats.org/drawingml/2006/wordprocessingDrawing" xmlns:wpg="http://schemas.microsoft.com/office/word/2010/wordprocessingGroup" xmlns:wpi="http://schemas.microsoft.com/office/word/2010/wordprocessingInk" xmlns:wps="http://schemas.microsoft.com/office/word/2010/wordprocessingShape" xmlns:o="urn:schemas-microsoft-com:office:office" xmlns:v="urn:schemas-microsoft-com:vml" xmlns:w10="urn:schemas-microsoft-com:office:word" xmlns:w="http://schemas.openxmlformats.org/wordprocessingml/2006/main" xmlns:w14="http://schemas.microsoft.com/office/word/2010/wordml" xmlns:w15="http://schemas.microsoft.com/office/word/2012/wordml" xmlns:w16cei="http://schemas.microsoft.com/office/word/2026/wordml/cei" xmlns:w16cex="http://schemas.microsoft.com/office/word/2018/wordml/cex" xmlns:w16cid="http://schemas.microsoft.com/office/word/2016/wordml/cid" xmlns:w16="http://schemas.microsoft.com/office/word/2018/wordml" xmlns:w16sdtdh="http://schemas.microsoft.com/office/word/2020/wordml/sdtdatahash" xmlns:w16sdtfl="http://schemas.microsoft.com/office/word/2024/wordml/sdtformatlock" xmlns:w16se="http://schemas.microsoft.com/office/word/2015/wordml/symex" xmlns:w16du="http://schemas.microsoft.com/office/word/2023/wordml/word16du" xmlns:wne="http://schemas.microsoft.com/office/word/2006/wordml" mc:Ignorable="w14 w15 w16se w16cid w16 w16cex w16sdtdh w16sdtfl w16du wp14">
   <w:endnote w:type="separator" w:id="-1">
     <w:p>
       <w:r>
@@ -25055,7 +25024,7 @@
 </file>
 
 <file path=word/footer1.xml><?xml version="1.0" encoding="utf-8"?>
-<w:ftr xmlns:wpc="http://schemas.microsoft.com/office/word/2010/wordprocessingCanvas" xmlns:cx="http://schemas.microsoft.com/office/drawing/2014/chartex" xmlns:cx1="http://schemas.microsoft.com/office/drawing/2015/9/8/chartex" xmlns:cx2="http://schemas.microsoft.com/office/drawing/2015/10/21/chartex" xmlns:cx3="http://schemas.microsoft.com/office/drawing/2016/5/9/chartex" xmlns:cx4="http://schemas.microsoft.com/office/drawing/2016/5/10/chartex" xmlns:cx5="http://schemas.microsoft.com/office/drawing/2016/5/11/chartex" xmlns:cx6="http://schemas.microsoft.com/office/drawing/2016/5/12/chartex" xmlns:cx7="http://schemas.microsoft.com/office/drawing/2016/5/13/chartex" xmlns:cx8="http://schemas.microsoft.com/office/drawing/2016/5/14/chartex" xmlns:mc="http://schemas.openxmlformats.org/markup-compatibility/2006" xmlns:aink="http://schemas.microsoft.com/office/drawing/2016/ink" xmlns:am3d="http://schemas.microsoft.com/office/drawing/2017/model3d" xmlns:o="urn:schemas-microsoft-com:office:office" xmlns:oel="http://schemas.microsoft.com/office/2019/extlst" xmlns:r="http://schemas.openxmlformats.org/officeDocument/2006/relationships" xmlns:m="http://schemas.openxmlformats.org/officeDocument/2006/math" xmlns:v="urn:schemas-microsoft-com:vml" xmlns:wp14="http://schemas.microsoft.com/office/word/2010/wordprocessingDrawing" xmlns:wp="http://schemas.openxmlformats.org/drawingml/2006/wordprocessingDrawing" xmlns:w10="urn:schemas-microsoft-com:office:word" xmlns:w="http://schemas.openxmlformats.org/wordprocessingml/2006/main" xmlns:w14="http://schemas.microsoft.com/office/word/2010/wordml" xmlns:w15="http://schemas.microsoft.com/office/word/2012/wordml" xmlns:w16cex="http://schemas.microsoft.com/office/word/2018/wordml/cex" xmlns:w16cid="http://schemas.microsoft.com/office/word/2016/wordml/cid" xmlns:w16="http://schemas.microsoft.com/office/word/2018/wordml" xmlns:w16du="http://schemas.microsoft.com/office/word/2023/wordml/word16du" xmlns:w16sdtdh="http://schemas.microsoft.com/office/word/2020/wordml/sdtdatahash" xmlns:w16sdtfl="http://schemas.microsoft.com/office/word/2024/wordml/sdtformatlock" xmlns:w16se="http://schemas.microsoft.com/office/word/2015/wordml/symex" xmlns:wpg="http://schemas.microsoft.com/office/word/2010/wordprocessingGroup" xmlns:wpi="http://schemas.microsoft.com/office/word/2010/wordprocessingInk" xmlns:wne="http://schemas.microsoft.com/office/word/2006/wordml" xmlns:wps="http://schemas.microsoft.com/office/word/2010/wordprocessingShape" mc:Ignorable="w14 w15 w16se w16cid w16 w16cex w16sdtdh w16sdtfl w16du wp14">
+<w:ftr xmlns:wpc="http://schemas.microsoft.com/office/word/2010/wordprocessingCanvas" xmlns:cx="http://schemas.microsoft.com/office/drawing/2014/chartex" xmlns:cx1="http://schemas.microsoft.com/office/drawing/2015/9/8/chartex" xmlns:cx2="http://schemas.microsoft.com/office/drawing/2015/10/21/chartex" xmlns:cx3="http://schemas.microsoft.com/office/drawing/2016/5/9/chartex" xmlns:cx4="http://schemas.microsoft.com/office/drawing/2016/5/10/chartex" xmlns:cx5="http://schemas.microsoft.com/office/drawing/2016/5/11/chartex" xmlns:cx6="http://schemas.microsoft.com/office/drawing/2016/5/12/chartex" xmlns:cx7="http://schemas.microsoft.com/office/drawing/2016/5/13/chartex" xmlns:cx8="http://schemas.microsoft.com/office/drawing/2016/5/14/chartex" xmlns:mc="http://schemas.openxmlformats.org/markup-compatibility/2006" xmlns:m="http://schemas.openxmlformats.org/officeDocument/2006/math" xmlns:aink="http://schemas.microsoft.com/office/drawing/2016/ink" xmlns:am3d="http://schemas.microsoft.com/office/drawing/2017/model3d" xmlns:oel="http://schemas.microsoft.com/office/2019/extlst" xmlns:r="http://schemas.openxmlformats.org/officeDocument/2006/relationships" xmlns:wp14="http://schemas.microsoft.com/office/word/2010/wordprocessingDrawing" xmlns:wp="http://schemas.openxmlformats.org/drawingml/2006/wordprocessingDrawing" xmlns:wpg="http://schemas.microsoft.com/office/word/2010/wordprocessingGroup" xmlns:wpi="http://schemas.microsoft.com/office/word/2010/wordprocessingInk" xmlns:wps="http://schemas.microsoft.com/office/word/2010/wordprocessingShape" xmlns:o="urn:schemas-microsoft-com:office:office" xmlns:v="urn:schemas-microsoft-com:vml" xmlns:w10="urn:schemas-microsoft-com:office:word" xmlns:w="http://schemas.openxmlformats.org/wordprocessingml/2006/main" xmlns:w14="http://schemas.microsoft.com/office/word/2010/wordml" xmlns:w15="http://schemas.microsoft.com/office/word/2012/wordml" xmlns:w16cei="http://schemas.microsoft.com/office/word/2026/wordml/cei" xmlns:w16cex="http://schemas.microsoft.com/office/word/2018/wordml/cex" xmlns:w16cid="http://schemas.microsoft.com/office/word/2016/wordml/cid" xmlns:w16="http://schemas.microsoft.com/office/word/2018/wordml" xmlns:w16sdtdh="http://schemas.microsoft.com/office/word/2020/wordml/sdtdatahash" xmlns:w16sdtfl="http://schemas.microsoft.com/office/word/2024/wordml/sdtformatlock" xmlns:w16se="http://schemas.microsoft.com/office/word/2015/wordml/symex" xmlns:w16du="http://schemas.microsoft.com/office/word/2023/wordml/word16du" xmlns:wne="http://schemas.microsoft.com/office/word/2006/wordml" mc:Ignorable="w14 w15 w16se w16cid w16 w16cex w16sdtdh w16sdtfl w16du wp14">
   <w:p>
     <w:pPr>
       <w:pStyle w:val="Footer"/>
@@ -25177,7 +25146,7 @@
 </file>
 
 <file path=word/footnotes.xml><?xml version="1.0" encoding="utf-8"?>
-<w:footnotes xmlns:wpc="http://schemas.microsoft.com/office/word/2010/wordprocessingCanvas" xmlns:cx="http://schemas.microsoft.com/office/drawing/2014/chartex" xmlns:cx1="http://schemas.microsoft.com/office/drawing/2015/9/8/chartex" xmlns:cx2="http://schemas.microsoft.com/office/drawing/2015/10/21/chartex" xmlns:cx3="http://schemas.microsoft.com/office/drawing/2016/5/9/chartex" xmlns:cx4="http://schemas.microsoft.com/office/drawing/2016/5/10/chartex" xmlns:cx5="http://schemas.microsoft.com/office/drawing/2016/5/11/chartex" xmlns:cx6="http://schemas.microsoft.com/office/drawing/2016/5/12/chartex" xmlns:cx7="http://schemas.microsoft.com/office/drawing/2016/5/13/chartex" xmlns:cx8="http://schemas.microsoft.com/office/drawing/2016/5/14/chartex" xmlns:mc="http://schemas.openxmlformats.org/markup-compatibility/2006" xmlns:aink="http://schemas.microsoft.com/office/drawing/2016/ink" xmlns:am3d="http://schemas.microsoft.com/office/drawing/2017/model3d" xmlns:o="urn:schemas-microsoft-com:office:office" xmlns:oel="http://schemas.microsoft.com/office/2019/extlst" xmlns:r="http://schemas.openxmlformats.org/officeDocument/2006/relationships" xmlns:m="http://schemas.openxmlformats.org/officeDocument/2006/math" xmlns:v="urn:schemas-microsoft-com:vml" xmlns:wp14="http://schemas.microsoft.com/office/word/2010/wordprocessingDrawing" xmlns:wp="http://schemas.openxmlformats.org/drawingml/2006/wordprocessingDrawing" xmlns:w10="urn:schemas-microsoft-com:office:word" xmlns:w="http://schemas.openxmlformats.org/wordprocessingml/2006/main" xmlns:w14="http://schemas.microsoft.com/office/word/2010/wordml" xmlns:w15="http://schemas.microsoft.com/office/word/2012/wordml" xmlns:w16cex="http://schemas.microsoft.com/office/word/2018/wordml/cex" xmlns:w16cid="http://schemas.microsoft.com/office/word/2016/wordml/cid" xmlns:w16="http://schemas.microsoft.com/office/word/2018/wordml" xmlns:w16du="http://schemas.microsoft.com/office/word/2023/wordml/word16du" xmlns:w16sdtdh="http://schemas.microsoft.com/office/word/2020/wordml/sdtdatahash" xmlns:w16sdtfl="http://schemas.microsoft.com/office/word/2024/wordml/sdtformatlock" xmlns:w16se="http://schemas.microsoft.com/office/word/2015/wordml/symex" xmlns:wpg="http://schemas.microsoft.com/office/word/2010/wordprocessingGroup" xmlns:wpi="http://schemas.microsoft.com/office/word/2010/wordprocessingInk" xmlns:wne="http://schemas.microsoft.com/office/word/2006/wordml" xmlns:wps="http://schemas.microsoft.com/office/word/2010/wordprocessingShape" mc:Ignorable="w14 w15 w16se w16cid w16 w16cex w16sdtdh w16sdtfl w16du wp14">
+<w:footnotes xmlns:wpc="http://schemas.microsoft.com/office/word/2010/wordprocessingCanvas" xmlns:cx="http://schemas.microsoft.com/office/drawing/2014/chartex" xmlns:cx1="http://schemas.microsoft.com/office/drawing/2015/9/8/chartex" xmlns:cx2="http://schemas.microsoft.com/office/drawing/2015/10/21/chartex" xmlns:cx3="http://schemas.microsoft.com/office/drawing/2016/5/9/chartex" xmlns:cx4="http://schemas.microsoft.com/office/drawing/2016/5/10/chartex" xmlns:cx5="http://schemas.microsoft.com/office/drawing/2016/5/11/chartex" xmlns:cx6="http://schemas.microsoft.com/office/drawing/2016/5/12/chartex" xmlns:cx7="http://schemas.microsoft.com/office/drawing/2016/5/13/chartex" xmlns:cx8="http://schemas.microsoft.com/office/drawing/2016/5/14/chartex" xmlns:mc="http://schemas.openxmlformats.org/markup-compatibility/2006" xmlns:m="http://schemas.openxmlformats.org/officeDocument/2006/math" xmlns:aink="http://schemas.microsoft.com/office/drawing/2016/ink" xmlns:am3d="http://schemas.microsoft.com/office/drawing/2017/model3d" xmlns:oel="http://schemas.microsoft.com/office/2019/extlst" xmlns:r="http://schemas.openxmlformats.org/officeDocument/2006/relationships" xmlns:wp14="http://schemas.microsoft.com/office/word/2010/wordprocessingDrawing" xmlns:wp="http://schemas.openxmlformats.org/drawingml/2006/wordprocessingDrawing" xmlns:wpg="http://schemas.microsoft.com/office/word/2010/wordprocessingGroup" xmlns:wpi="http://schemas.microsoft.com/office/word/2010/wordprocessingInk" xmlns:wps="http://schemas.microsoft.com/office/word/2010/wordprocessingShape" xmlns:o="urn:schemas-microsoft-com:office:office" xmlns:v="urn:schemas-microsoft-com:vml" xmlns:w10="urn:schemas-microsoft-com:office:word" xmlns:w="http://schemas.openxmlformats.org/wordprocessingml/2006/main" xmlns:w14="http://schemas.microsoft.com/office/word/2010/wordml" xmlns:w15="http://schemas.microsoft.com/office/word/2012/wordml" xmlns:w16cei="http://schemas.microsoft.com/office/word/2026/wordml/cei" xmlns:w16cex="http://schemas.microsoft.com/office/word/2018/wordml/cex" xmlns:w16cid="http://schemas.microsoft.com/office/word/2016/wordml/cid" xmlns:w16="http://schemas.microsoft.com/office/word/2018/wordml" xmlns:w16sdtdh="http://schemas.microsoft.com/office/word/2020/wordml/sdtdatahash" xmlns:w16sdtfl="http://schemas.microsoft.com/office/word/2024/wordml/sdtformatlock" xmlns:w16se="http://schemas.microsoft.com/office/word/2015/wordml/symex" xmlns:w16du="http://schemas.microsoft.com/office/word/2023/wordml/word16du" xmlns:wne="http://schemas.microsoft.com/office/word/2006/wordml" mc:Ignorable="w14 w15 w16se w16cid w16 w16cex w16sdtdh w16sdtfl w16du wp14">
   <w:footnote w:type="separator" w:id="-1">
     <w:p>
       <w:r>
@@ -25199,7 +25168,7 @@
 </file>
 
 <file path=word/header1.xml><?xml version="1.0" encoding="utf-8"?>
-<w:hdr xmlns:wpc="http://schemas.microsoft.com/office/word/2010/wordprocessingCanvas" xmlns:cx="http://schemas.microsoft.com/office/drawing/2014/chartex" xmlns:cx1="http://schemas.microsoft.com/office/drawing/2015/9/8/chartex" xmlns:cx2="http://schemas.microsoft.com/office/drawing/2015/10/21/chartex" xmlns:cx3="http://schemas.microsoft.com/office/drawing/2016/5/9/chartex" xmlns:cx4="http://schemas.microsoft.com/office/drawing/2016/5/10/chartex" xmlns:cx5="http://schemas.microsoft.com/office/drawing/2016/5/11/chartex" xmlns:cx6="http://schemas.microsoft.com/office/drawing/2016/5/12/chartex" xmlns:cx7="http://schemas.microsoft.com/office/drawing/2016/5/13/chartex" xmlns:cx8="http://schemas.microsoft.com/office/drawing/2016/5/14/chartex" xmlns:mc="http://schemas.openxmlformats.org/markup-compatibility/2006" xmlns:aink="http://schemas.microsoft.com/office/drawing/2016/ink" xmlns:am3d="http://schemas.microsoft.com/office/drawing/2017/model3d" xmlns:o="urn:schemas-microsoft-com:office:office" xmlns:oel="http://schemas.microsoft.com/office/2019/extlst" xmlns:r="http://schemas.openxmlformats.org/officeDocument/2006/relationships" xmlns:m="http://schemas.openxmlformats.org/officeDocument/2006/math" xmlns:v="urn:schemas-microsoft-com:vml" xmlns:wp14="http://schemas.microsoft.com/office/word/2010/wordprocessingDrawing" xmlns:wp="http://schemas.openxmlformats.org/drawingml/2006/wordprocessingDrawing" xmlns:w10="urn:schemas-microsoft-com:office:word" xmlns:w="http://schemas.openxmlformats.org/wordprocessingml/2006/main" xmlns:w14="http://schemas.microsoft.com/office/word/2010/wordml" xmlns:w15="http://schemas.microsoft.com/office/word/2012/wordml" xmlns:w16cex="http://schemas.microsoft.com/office/word/2018/wordml/cex" xmlns:w16cid="http://schemas.microsoft.com/office/word/2016/wordml/cid" xmlns:w16="http://schemas.microsoft.com/office/word/2018/wordml" xmlns:w16du="http://schemas.microsoft.com/office/word/2023/wordml/word16du" xmlns:w16sdtdh="http://schemas.microsoft.com/office/word/2020/wordml/sdtdatahash" xmlns:w16sdtfl="http://schemas.microsoft.com/office/word/2024/wordml/sdtformatlock" xmlns:w16se="http://schemas.microsoft.com/office/word/2015/wordml/symex" xmlns:wpg="http://schemas.microsoft.com/office/word/2010/wordprocessingGroup" xmlns:wpi="http://schemas.microsoft.com/office/word/2010/wordprocessingInk" xmlns:wne="http://schemas.microsoft.com/office/word/2006/wordml" xmlns:wps="http://schemas.microsoft.com/office/word/2010/wordprocessingShape" mc:Ignorable="w14 w15 w16se w16cid w16 w16cex w16sdtdh w16sdtfl w16du wp14">
+<w:hdr xmlns:wpc="http://schemas.microsoft.com/office/word/2010/wordprocessingCanvas" xmlns:cx="http://schemas.microsoft.com/office/drawing/2014/chartex" xmlns:cx1="http://schemas.microsoft.com/office/drawing/2015/9/8/chartex" xmlns:cx2="http://schemas.microsoft.com/office/drawing/2015/10/21/chartex" xmlns:cx3="http://schemas.microsoft.com/office/drawing/2016/5/9/chartex" xmlns:cx4="http://schemas.microsoft.com/office/drawing/2016/5/10/chartex" xmlns:cx5="http://schemas.microsoft.com/office/drawing/2016/5/11/chartex" xmlns:cx6="http://schemas.microsoft.com/office/drawing/2016/5/12/chartex" xmlns:cx7="http://schemas.microsoft.com/office/drawing/2016/5/13/chartex" xmlns:cx8="http://schemas.microsoft.com/office/drawing/2016/5/14/chartex" xmlns:mc="http://schemas.openxmlformats.org/markup-compatibility/2006" xmlns:m="http://schemas.openxmlformats.org/officeDocument/2006/math" xmlns:aink="http://schemas.microsoft.com/office/drawing/2016/ink" xmlns:am3d="http://schemas.microsoft.com/office/drawing/2017/model3d" xmlns:oel="http://schemas.microsoft.com/office/2019/extlst" xmlns:r="http://schemas.openxmlformats.org/officeDocument/2006/relationships" xmlns:wp14="http://schemas.microsoft.com/office/word/2010/wordprocessingDrawing" xmlns:wp="http://schemas.openxmlformats.org/drawingml/2006/wordprocessingDrawing" xmlns:wpg="http://schemas.microsoft.com/office/word/2010/wordprocessingGroup" xmlns:wpi="http://schemas.microsoft.com/office/word/2010/wordprocessingInk" xmlns:wps="http://schemas.microsoft.com/office/word/2010/wordprocessingShape" xmlns:o="urn:schemas-microsoft-com:office:office" xmlns:v="urn:schemas-microsoft-com:vml" xmlns:w10="urn:schemas-microsoft-com:office:word" xmlns:w="http://schemas.openxmlformats.org/wordprocessingml/2006/main" xmlns:w14="http://schemas.microsoft.com/office/word/2010/wordml" xmlns:w15="http://schemas.microsoft.com/office/word/2012/wordml" xmlns:w16cei="http://schemas.microsoft.com/office/word/2026/wordml/cei" xmlns:w16cex="http://schemas.microsoft.com/office/word/2018/wordml/cex" xmlns:w16cid="http://schemas.microsoft.com/office/word/2016/wordml/cid" xmlns:w16="http://schemas.microsoft.com/office/word/2018/wordml" xmlns:w16sdtdh="http://schemas.microsoft.com/office/word/2020/wordml/sdtdatahash" xmlns:w16sdtfl="http://schemas.microsoft.com/office/word/2024/wordml/sdtformatlock" xmlns:w16se="http://schemas.microsoft.com/office/word/2015/wordml/symex" xmlns:w16du="http://schemas.microsoft.com/office/word/2023/wordml/word16du" xmlns:wne="http://schemas.microsoft.com/office/word/2006/wordml" mc:Ignorable="w14 w15 w16se w16cid w16 w16cex w16sdtdh w16sdtfl w16du wp14">
   <w:p>
     <w:pPr>
       <w:pStyle w:val="Header"/>
@@ -25250,7 +25219,7 @@
 </file>
 
 <file path=word/numbering.xml><?xml version="1.0" encoding="utf-8"?>
-<w:numbering xmlns:wpc="http://schemas.microsoft.com/office/word/2010/wordprocessingCanvas" xmlns:cx="http://schemas.microsoft.com/office/drawing/2014/chartex" xmlns:cx1="http://schemas.microsoft.com/office/drawing/2015/9/8/chartex" xmlns:cx2="http://schemas.microsoft.com/office/drawing/2015/10/21/chartex" xmlns:cx3="http://schemas.microsoft.com/office/drawing/2016/5/9/chartex" xmlns:cx4="http://schemas.microsoft.com/office/drawing/2016/5/10/chartex" xmlns:cx5="http://schemas.microsoft.com/office/drawing/2016/5/11/chartex" xmlns:cx6="http://schemas.microsoft.com/office/drawing/2016/5/12/chartex" xmlns:cx7="http://schemas.microsoft.com/office/drawing/2016/5/13/chartex" xmlns:cx8="http://schemas.microsoft.com/office/drawing/2016/5/14/chartex" xmlns:mc="http://schemas.openxmlformats.org/markup-compatibility/2006" xmlns:aink="http://schemas.microsoft.com/office/drawing/2016/ink" xmlns:am3d="http://schemas.microsoft.com/office/drawing/2017/model3d" xmlns:o="urn:schemas-microsoft-com:office:office" xmlns:oel="http://schemas.microsoft.com/office/2019/extlst" xmlns:r="http://schemas.openxmlformats.org/officeDocument/2006/relationships" xmlns:m="http://schemas.openxmlformats.org/officeDocument/2006/math" xmlns:v="urn:schemas-microsoft-com:vml" xmlns:wp14="http://schemas.microsoft.com/office/word/2010/wordprocessingDrawing" xmlns:wp="http://schemas.openxmlformats.org/drawingml/2006/wordprocessingDrawing" xmlns:w10="urn:schemas-microsoft-com:office:word" xmlns:w="http://schemas.openxmlformats.org/wordprocessingml/2006/main" xmlns:w14="http://schemas.microsoft.com/office/word/2010/wordml" xmlns:w15="http://schemas.microsoft.com/office/word/2012/wordml" xmlns:w16cex="http://schemas.microsoft.com/office/word/2018/wordml/cex" xmlns:w16cid="http://schemas.microsoft.com/office/word/2016/wordml/cid" xmlns:w16="http://schemas.microsoft.com/office/word/2018/wordml" xmlns:w16du="http://schemas.microsoft.com/office/word/2023/wordml/word16du" xmlns:w16sdtdh="http://schemas.microsoft.com/office/word/2020/wordml/sdtdatahash" xmlns:w16sdtfl="http://schemas.microsoft.com/office/word/2024/wordml/sdtformatlock" xmlns:w16se="http://schemas.microsoft.com/office/word/2015/wordml/symex" xmlns:wpg="http://schemas.microsoft.com/office/word/2010/wordprocessingGroup" xmlns:wpi="http://schemas.microsoft.com/office/word/2010/wordprocessingInk" xmlns:wne="http://schemas.microsoft.com/office/word/2006/wordml" xmlns:wps="http://schemas.microsoft.com/office/word/2010/wordprocessingShape" mc:Ignorable="w14 w15 w16se w16cid w16 w16cex w16sdtdh w16sdtfl w16du wp14">
+<w:numbering xmlns:wpc="http://schemas.microsoft.com/office/word/2010/wordprocessingCanvas" xmlns:cx="http://schemas.microsoft.com/office/drawing/2014/chartex" xmlns:cx1="http://schemas.microsoft.com/office/drawing/2015/9/8/chartex" xmlns:cx2="http://schemas.microsoft.com/office/drawing/2015/10/21/chartex" xmlns:cx3="http://schemas.microsoft.com/office/drawing/2016/5/9/chartex" xmlns:cx4="http://schemas.microsoft.com/office/drawing/2016/5/10/chartex" xmlns:cx5="http://schemas.microsoft.com/office/drawing/2016/5/11/chartex" xmlns:cx6="http://schemas.microsoft.com/office/drawing/2016/5/12/chartex" xmlns:cx7="http://schemas.microsoft.com/office/drawing/2016/5/13/chartex" xmlns:cx8="http://schemas.microsoft.com/office/drawing/2016/5/14/chartex" xmlns:mc="http://schemas.openxmlformats.org/markup-compatibility/2006" xmlns:m="http://schemas.openxmlformats.org/officeDocument/2006/math" xmlns:aink="http://schemas.microsoft.com/office/drawing/2016/ink" xmlns:am3d="http://schemas.microsoft.com/office/drawing/2017/model3d" xmlns:oel="http://schemas.microsoft.com/office/2019/extlst" xmlns:r="http://schemas.openxmlformats.org/officeDocument/2006/relationships" xmlns:wp14="http://schemas.microsoft.com/office/word/2010/wordprocessingDrawing" xmlns:wp="http://schemas.openxmlformats.org/drawingml/2006/wordprocessingDrawing" xmlns:wpg="http://schemas.microsoft.com/office/word/2010/wordprocessingGroup" xmlns:wpi="http://schemas.microsoft.com/office/word/2010/wordprocessingInk" xmlns:wps="http://schemas.microsoft.com/office/word/2010/wordprocessingShape" xmlns:o="urn:schemas-microsoft-com:office:office" xmlns:v="urn:schemas-microsoft-com:vml" xmlns:w10="urn:schemas-microsoft-com:office:word" xmlns:w="http://schemas.openxmlformats.org/wordprocessingml/2006/main" xmlns:w14="http://schemas.microsoft.com/office/word/2010/wordml" xmlns:w15="http://schemas.microsoft.com/office/word/2012/wordml" xmlns:w16cei="http://schemas.microsoft.com/office/word/2026/wordml/cei" xmlns:w16cex="http://schemas.microsoft.com/office/word/2018/wordml/cex" xmlns:w16cid="http://schemas.microsoft.com/office/word/2016/wordml/cid" xmlns:w16="http://schemas.microsoft.com/office/word/2018/wordml" xmlns:w16sdtdh="http://schemas.microsoft.com/office/word/2020/wordml/sdtdatahash" xmlns:w16sdtfl="http://schemas.microsoft.com/office/word/2024/wordml/sdtformatlock" xmlns:w16se="http://schemas.microsoft.com/office/word/2015/wordml/symex" xmlns:w16du="http://schemas.microsoft.com/office/word/2023/wordml/word16du" xmlns:wne="http://schemas.microsoft.com/office/word/2006/wordml" mc:Ignorable="w14 w15 w16se w16cid w16 w16cex w16sdtdh w16sdtfl w16du wp14">
   <w:abstractNum w:abstractNumId="0" w15:restartNumberingAfterBreak="0">
     <w:nsid w:val="01804C27"/>
     <w:multiLevelType w:val="multilevel"/>
@@ -27365,7 +27334,7 @@
 </file>
 
 <file path=word/styles.xml><?xml version="1.0" encoding="utf-8"?>
-<w:styles xmlns:mc="http://schemas.openxmlformats.org/markup-compatibility/2006" xmlns:r="http://schemas.openxmlformats.org/officeDocument/2006/relationships" xmlns:w="http://schemas.openxmlformats.org/wordprocessingml/2006/main" xmlns:w14="http://schemas.microsoft.com/office/word/2010/wordml" xmlns:w15="http://schemas.microsoft.com/office/word/2012/wordml" xmlns:w16cex="http://schemas.microsoft.com/office/word/2018/wordml/cex" xmlns:w16cid="http://schemas.microsoft.com/office/word/2016/wordml/cid" xmlns:w16="http://schemas.microsoft.com/office/word/2018/wordml" xmlns:w16du="http://schemas.microsoft.com/office/word/2023/wordml/word16du" xmlns:w16sdtdh="http://schemas.microsoft.com/office/word/2020/wordml/sdtdatahash" xmlns:w16sdtfl="http://schemas.microsoft.com/office/word/2024/wordml/sdtformatlock" xmlns:w16se="http://schemas.microsoft.com/office/word/2015/wordml/symex" mc:Ignorable="w14 w15 w16se w16cid w16 w16cex w16sdtdh w16sdtfl w16du">
+<w:styles xmlns:mc="http://schemas.openxmlformats.org/markup-compatibility/2006" xmlns:r="http://schemas.openxmlformats.org/officeDocument/2006/relationships" xmlns:w="http://schemas.openxmlformats.org/wordprocessingml/2006/main" xmlns:w14="http://schemas.microsoft.com/office/word/2010/wordml" xmlns:w15="http://schemas.microsoft.com/office/word/2012/wordml" xmlns:w16cex="http://schemas.microsoft.com/office/word/2018/wordml/cex" xmlns:w16cid="http://schemas.microsoft.com/office/word/2016/wordml/cid" xmlns:w16="http://schemas.microsoft.com/office/word/2018/wordml" xmlns:w16sdtdh="http://schemas.microsoft.com/office/word/2020/wordml/sdtdatahash" xmlns:w16sdtfl="http://schemas.microsoft.com/office/word/2024/wordml/sdtformatlock" xmlns:w16se="http://schemas.microsoft.com/office/word/2015/wordml/symex" xmlns:w16du="http://schemas.microsoft.com/office/word/2023/wordml/word16du" mc:Ignorable="w14 w15 w16se w16cid w16 w16cex w16sdtdh w16sdtfl w16du">
   <w:docDefaults>
     <w:rPrDefault>
       <w:rPr>

</xml_diff>